<commit_message>
docs: update docx to list errors only
Agent-Logs-Url: https://github.com/tdtrong945/btlweb/sessions/9f63c0c7-f3de-4744-a71f-c4e71eb1851d

Co-authored-by: tdtrong945 <257135914+tdtrong945@users.noreply.github.com>
</commit_message>
<xml_diff>
--- a/docs/BaoCao_UnitTest_Va_Loi.docx
+++ b/docs/BaoCao_UnitTest_Va_Loi.docx
@@ -7,7 +7,7 @@
         <w:pStyle w:val="Heading1"/>
       </w:pPr>
       <w:r>
-        <w:t>Báo cáo Unit Test và Lỗi phát hiện</w:t>
+        <w:t>Danh sách lỗi</w:t>
       </w:r>
     </w:p>
     <w:p>
@@ -17,7 +17,7 @@
     </w:p>
     <w:p>
       <w:r>
-        <w:t>Thư mục mã nguồn: /home/runner/work/btlweb/btlweb</w:t>
+        <w:t>Thời điểm tổng hợp: 2026-04-19</w:t>
       </w:r>
     </w:p>
     <w:p>
@@ -25,17 +25,31 @@
         <w:pStyle w:val="Heading2"/>
       </w:pPr>
       <w:r>
-        <w:t>1. Tổng quan bộ Unit Test</w:t>
+        <w:t>1) Nhóm PetService (ảnh: nội dung/kích thước/định dạng)</w:t>
       </w:r>
     </w:p>
     <w:p>
+      <w:pPr>
+        <w:pStyle w:val="ListBullet"/>
+      </w:pPr>
       <w:r>
-        <w:t>Đã tạo test project: BTL_WEB.Tests (xUnit + EF Core InMemory).</w:t>
+        <w:t>Chưa có bộ unit test tự động bao phủ đầy đủ các trường hợp upload ảnh hợp lệ/không hợp lệ.</w:t>
       </w:r>
     </w:p>
     <w:p>
+      <w:pPr>
+        <w:pStyle w:val="ListBullet"/>
+      </w:pPr>
       <w:r>
-        <w:t>Tổng số test hiện tại: 19 test, chạy thành công 19/19.</w:t>
+        <w:t>Chưa có test tự động cho ngưỡng kích thước biên (0 byte, sát 5MB, vượt 5MB).</w:t>
+      </w:r>
+    </w:p>
+    <w:p>
+      <w:pPr>
+        <w:pStyle w:val="ListBullet"/>
+      </w:pPr>
+      <w:r>
+        <w:t>Chưa có test tự động cho trường hợp đuôi file hợp lệ nhưng content-type/chữ ký file không hợp lệ.</w:t>
       </w:r>
     </w:p>
     <w:p>
@@ -43,7 +57,7 @@
         <w:pStyle w:val="Heading2"/>
       </w:pPr>
       <w:r>
-        <w:t>2. Danh sách test đã viết</w:t>
+        <w:t>2) Nhóm API Controller (PetsApiController, ServicesApiController, AppointmentsApiController)</w:t>
       </w:r>
     </w:p>
     <w:p>
@@ -51,7 +65,7 @@
         <w:pStyle w:val="ListBullet"/>
       </w:pPr>
       <w:r>
-        <w:t>BTL_WEB.Tests/Helpers/PasswordHasherTests.cs: 4 test</w:t>
+        <w:t>Chưa có unit test cho các nhánh thành công/thất bại của endpoint GET/POST/PUT/PATCH/DELETE.</w:t>
       </w:r>
     </w:p>
     <w:p>
@@ -59,7 +73,7 @@
         <w:pStyle w:val="ListBullet"/>
       </w:pPr>
       <w:r>
-        <w:t>BTL_WEB.Tests/Helpers/HttpRequestExtensionsTests.cs: 4 test</w:t>
+        <w:t>Chưa có test cho các trường hợp phân trang đầu vào không hợp lệ (page/pageSize).</w:t>
       </w:r>
     </w:p>
     <w:p>
@@ -67,7 +81,7 @@
         <w:pStyle w:val="ListBullet"/>
       </w:pPr>
       <w:r>
-        <w:t>BTL_WEB.Tests/Helpers/PaginatedListTests.cs: 3 test</w:t>
+        <w:t>Chưa có test cho phân quyền theo vai trò (Customer/Staff/Admin) trên các endpoint API.</w:t>
       </w:r>
     </w:p>
     <w:p>
@@ -75,7 +89,15 @@
         <w:pStyle w:val="ListBullet"/>
       </w:pPr>
       <w:r>
-        <w:t>BTL_WEB.Tests/Services/AppointmentWorkflowServiceTests.cs: 4 test</w:t>
+        <w:t>Chưa có test cho các trường hợp dữ liệu không tồn tại (NotFound) và dữ liệu không hợp lệ (BadRequest).</w:t>
+      </w:r>
+    </w:p>
+    <w:p>
+      <w:pPr>
+        <w:pStyle w:val="Heading2"/>
+      </w:pPr>
+      <w:r>
+        <w:t>3) Nhóm integration test (luồng đặt lịch và thanh toán)</w:t>
       </w:r>
     </w:p>
     <w:p>
@@ -83,7 +105,7 @@
         <w:pStyle w:val="ListBullet"/>
       </w:pPr>
       <w:r>
-        <w:t>BTL_WEB.Tests/Services/AdoptionWorkflowServiceTests.cs: 4 test</w:t>
+        <w:t>Chưa có integration test end-to-end cho luồng tạo lịch hẹn -&gt; cập nhật trạng thái -&gt; phát sinh thanh toán.</w:t>
       </w:r>
     </w:p>
     <w:p>
@@ -91,43 +113,7 @@
         <w:pStyle w:val="ListBullet"/>
       </w:pPr>
       <w:r>
-        <w:t>BTL_WEB.Tests/TestInfrastructure/TestDbFactory.cs: hạ tầng tạo InMemory DB cho test</w:t>
-      </w:r>
-    </w:p>
-    <w:p>
-      <w:pPr>
-        <w:pStyle w:val="Heading2"/>
-      </w:pPr>
-      <w:r>
-        <w:t>3. Lỗi đã phát hiện qua Unit Test</w:t>
-      </w:r>
-    </w:p>
-    <w:p>
-      <w:r>
-        <w:t>Lỗi: PaginatedList.CreateAsync chưa validate tham số pageIndex/pageSize.</w:t>
-      </w:r>
-    </w:p>
-    <w:p>
-      <w:r>
-        <w:t>Biểu hiện: Khi pageIndex &lt;= 0 hoặc pageSize &lt;= 0, hàm không ném lỗi như kỳ vọng, có thể dẫn đến phân trang sai.</w:t>
-      </w:r>
-    </w:p>
-    <w:p>
-      <w:r>
-        <w:t>Vị trí: BTL_WEB/Helpers/PaginatedList.cs</w:t>
-      </w:r>
-    </w:p>
-    <w:p>
-      <w:r>
-        <w:t>Cách khắc phục: thêm kiểm tra và ném ArgumentOutOfRangeException cho pageIndex &lt; 1 và pageSize &lt; 1.</w:t>
-      </w:r>
-    </w:p>
-    <w:p>
-      <w:pPr>
-        <w:pStyle w:val="Heading2"/>
-      </w:pPr>
-      <w:r>
-        <w:t>4. Kết quả xác nhận sau khi sửa</w:t>
+        <w:t>Chưa có integration test cho các kịch bản lỗi giao dịch/thanh toán và tính nhất quán dữ liệu liên quan lịch hẹn.</w:t>
       </w:r>
     </w:p>
     <w:p>
@@ -135,47 +121,7 @@
         <w:pStyle w:val="ListBullet"/>
       </w:pPr>
       <w:r>
-        <w:t>dotnet build BTL_WEB.slnx -c Release: PASS</w:t>
-      </w:r>
-    </w:p>
-    <w:p>
-      <w:pPr>
-        <w:pStyle w:val="ListBullet"/>
-      </w:pPr>
-      <w:r>
-        <w:t>dotnet test BTL_WEB.slnx -c Release: PASS (19 passed, 0 failed)</w:t>
-      </w:r>
-    </w:p>
-    <w:p>
-      <w:pPr>
-        <w:pStyle w:val="Heading2"/>
-      </w:pPr>
-      <w:r>
-        <w:t>5. Gợi ý mở rộng test tiếp theo</w:t>
-      </w:r>
-    </w:p>
-    <w:p>
-      <w:pPr>
-        <w:pStyle w:val="ListBullet"/>
-      </w:pPr>
-      <w:r>
-        <w:t>Bổ sung test cho PetService (validate file ảnh, kích thước, định dạng nội dung).</w:t>
-      </w:r>
-    </w:p>
-    <w:p>
-      <w:pPr>
-        <w:pStyle w:val="ListBullet"/>
-      </w:pPr>
-      <w:r>
-        <w:t>Bổ sung test cho controller APIs (PetsApiController, ServicesApiController, AppointmentsApiController).</w:t>
-      </w:r>
-    </w:p>
-    <w:p>
-      <w:pPr>
-        <w:pStyle w:val="ListBullet"/>
-      </w:pPr>
-      <w:r>
-        <w:t>Bổ sung integration test theo luồng đặt lịch và thanh toán.</w:t>
+        <w:t>Chưa có integration test cho các trường hợp đồng thời (race condition) khi thao tác trên cùng lịch hẹn/thanh toán.</w:t>
       </w:r>
     </w:p>
     <w:sectPr>

</xml_diff>

<commit_message>
docs: list detected frontend and backend issues in docx
Agent-Logs-Url: https://github.com/tdtrong945/btlweb/sessions/217201db-ffc1-4db5-9003-c08054ea3675

Co-authored-by: tdtrong945 <257135914+tdtrong945@users.noreply.github.com>
</commit_message>
<xml_diff>
--- a/docs/BaoCao_UnitTest_Va_Loi.docx
+++ b/docs/BaoCao_UnitTest_Va_Loi.docx
@@ -7,7 +7,7 @@
         <w:pStyle w:val="Heading1"/>
       </w:pPr>
       <w:r>
-        <w:t>Danh sách lỗi</w:t>
+        <w:t>Danh sách lỗi phát hiện được (Frontend &amp; Backend)</w:t>
       </w:r>
     </w:p>
     <w:p>
@@ -25,7 +25,7 @@
         <w:pStyle w:val="Heading2"/>
       </w:pPr>
       <w:r>
-        <w:t>1) Nhóm PetService (ảnh: nội dung/kích thước/định dạng)</w:t>
+        <w:t>A. Backend</w:t>
       </w:r>
     </w:p>
     <w:p>
@@ -33,7 +33,7 @@
         <w:pStyle w:val="ListBullet"/>
       </w:pPr>
       <w:r>
-        <w:t>Chưa có bộ unit test tự động bao phủ đầy đủ các trường hợp upload ảnh hợp lệ/không hợp lệ.</w:t>
+        <w:t>PetsApiController.Update không kiểm tra ModelState trước khi ghi dữ liệu (BTL_WEB/Controllers/Api/PetsApiController.cs).</w:t>
       </w:r>
     </w:p>
     <w:p>
@@ -41,7 +41,7 @@
         <w:pStyle w:val="ListBullet"/>
       </w:pPr>
       <w:r>
-        <w:t>Chưa có test tự động cho ngưỡng kích thước biên (0 byte, sát 5MB, vượt 5MB).</w:t>
+        <w:t>ServicesApiController.Create không kiểm tra ModelState trước khi tạo dữ liệu (BTL_WEB/Controllers/Api/ServicesApiController.cs).</w:t>
       </w:r>
     </w:p>
     <w:p>
@@ -49,7 +49,47 @@
         <w:pStyle w:val="ListBullet"/>
       </w:pPr>
       <w:r>
-        <w:t>Chưa có test tự động cho trường hợp đuôi file hợp lệ nhưng content-type/chữ ký file không hợp lệ.</w:t>
+        <w:t>ServicesApiController.Update không kiểm tra ModelState trước khi cập nhật dữ liệu (BTL_WEB/Controllers/Api/ServicesApiController.cs).</w:t>
+      </w:r>
+    </w:p>
+    <w:p>
+      <w:pPr>
+        <w:pStyle w:val="ListBullet"/>
+      </w:pPr>
+      <w:r>
+        <w:t>AppointmentsApiController.Create không kiểm tra ModelState trước khi xử lý yêu cầu tạo lịch hẹn (BTL_WEB/Controllers/Api/AppointmentsApiController.cs).</w:t>
+      </w:r>
+    </w:p>
+    <w:p>
+      <w:pPr>
+        <w:pStyle w:val="ListBullet"/>
+      </w:pPr>
+      <w:r>
+        <w:t>AppointmentsApiController.UpdateStatus không kiểm tra ModelState trước khi xử lý cập nhật trạng thái (BTL_WEB/Controllers/Api/AppointmentsApiController.cs).</w:t>
+      </w:r>
+    </w:p>
+    <w:p>
+      <w:pPr>
+        <w:pStyle w:val="ListBullet"/>
+      </w:pPr>
+      <w:r>
+        <w:t>AppointmentsApiController.Create ánh xạ trực tiếp UserId từ request body vào model nghiệp vụ, tạo rủi ro sai lệch quyền thao tác theo người dùng (BTL_WEB/Controllers/Api/AppointmentsApiController.cs).</w:t>
+      </w:r>
+    </w:p>
+    <w:p>
+      <w:pPr>
+        <w:pStyle w:val="ListBullet"/>
+      </w:pPr>
+      <w:r>
+        <w:t>ServicesApiController.GetById trả trực tiếp entity Service thay vì DTO phản hồi riêng, làm không đồng nhất hợp đồng API với các endpoint còn lại (BTL_WEB/Controllers/Api/ServicesApiController.cs).</w:t>
+      </w:r>
+    </w:p>
+    <w:p>
+      <w:pPr>
+        <w:pStyle w:val="ListBullet"/>
+      </w:pPr>
+      <w:r>
+        <w:t>Code review hiện tại ghi nhận 2 lỗi chất lượng test backend: dùng null-forgiving khi test null và hard-code thông điệp lỗi trong assertion (BTL_WEB.Tests/Helpers/HttpRequestExtensionsTests.cs, BTL_WEB.Tests/Services/AdoptionWorkflowServiceTests.cs).</w:t>
       </w:r>
     </w:p>
     <w:p>
@@ -57,7 +97,7 @@
         <w:pStyle w:val="Heading2"/>
       </w:pPr>
       <w:r>
-        <w:t>2) Nhóm API Controller (PetsApiController, ServicesApiController, AppointmentsApiController)</w:t>
+        <w:t>B. Frontend</w:t>
       </w:r>
     </w:p>
     <w:p>
@@ -65,7 +105,7 @@
         <w:pStyle w:val="ListBullet"/>
       </w:pPr>
       <w:r>
-        <w:t>Chưa có unit test cho các nhánh thành công/thất bại của endpoint GET/POST/PUT/PATCH/DELETE.</w:t>
+        <w:t>Nhiều liên kết mạng xã hội đang để href="#" nên hành vi điều hướng không hoạt động thực tế (BTL_WEB/Views/Shared/_LayoutPetcarehub.cshtml).</w:t>
       </w:r>
     </w:p>
     <w:p>
@@ -73,7 +113,7 @@
         <w:pStyle w:val="ListBullet"/>
       </w:pPr>
       <w:r>
-        <w:t>Chưa có test cho các trường hợp phân trang đầu vào không hợp lệ (page/pageSize).</w:t>
+        <w:t>Thông tin liên hệ trên layout public đang là dữ liệu mẫu (+00 1234 567, youremail@email.com), không phải dữ liệu vận hành thực (BTL_WEB/Views/Shared/_LayoutPetcarehub.cshtml).</w:t>
       </w:r>
     </w:p>
     <w:p>
@@ -81,7 +121,15 @@
         <w:pStyle w:val="ListBullet"/>
       </w:pPr>
       <w:r>
-        <w:t>Chưa có test cho phân quyền theo vai trò (Customer/Staff/Admin) trên các endpoint API.</w:t>
+        <w:t>Không phát hiện lỗi biên dịch frontend trong phạm vi hiện có; frontend hiện không có bộ test tự động để phát hiện lỗi hành vi giao diện.</w:t>
+      </w:r>
+    </w:p>
+    <w:p>
+      <w:pPr>
+        <w:pStyle w:val="Heading2"/>
+      </w:pPr>
+      <w:r>
+        <w:t>C. Kết quả kiểm tra tự động</w:t>
       </w:r>
     </w:p>
     <w:p>
@@ -89,15 +137,7 @@
         <w:pStyle w:val="ListBullet"/>
       </w:pPr>
       <w:r>
-        <w:t>Chưa có test cho các trường hợp dữ liệu không tồn tại (NotFound) và dữ liệu không hợp lệ (BadRequest).</w:t>
-      </w:r>
-    </w:p>
-    <w:p>
-      <w:pPr>
-        <w:pStyle w:val="Heading2"/>
-      </w:pPr>
-      <w:r>
-        <w:t>3) Nhóm integration test (luồng đặt lịch và thanh toán)</w:t>
+        <w:t>dotnet build BTL_WEB.slnx -c Release: thành công, 0 errors, 0 warnings (lần chạy tuần tự).</w:t>
       </w:r>
     </w:p>
     <w:p>
@@ -105,23 +145,7 @@
         <w:pStyle w:val="ListBullet"/>
       </w:pPr>
       <w:r>
-        <w:t>Chưa có integration test end-to-end cho luồng tạo lịch hẹn -&gt; cập nhật trạng thái -&gt; phát sinh thanh toán.</w:t>
-      </w:r>
-    </w:p>
-    <w:p>
-      <w:pPr>
-        <w:pStyle w:val="ListBullet"/>
-      </w:pPr>
-      <w:r>
-        <w:t>Chưa có integration test cho các kịch bản lỗi giao dịch/thanh toán và tính nhất quán dữ liệu liên quan lịch hẹn.</w:t>
-      </w:r>
-    </w:p>
-    <w:p>
-      <w:pPr>
-        <w:pStyle w:val="ListBullet"/>
-      </w:pPr>
-      <w:r>
-        <w:t>Chưa có integration test cho các trường hợp đồng thời (race condition) khi thao tác trên cùng lịch hẹn/thanh toán.</w:t>
+        <w:t>dotnet test BTL_WEB.slnx -c Release: 19/19 test passed.</w:t>
       </w:r>
     </w:p>
     <w:sectPr>

</xml_diff>